<commit_message>
Polish: rewrite the opening in the venue-standard motivate-then-here-we-show structure (drop the methods-detail lead); add a page break after keywords (abstract on p1, body on p2); zero the body paragraph indent that leaked into table cells and captions. Data and code unchanged; release verify 85/85.
</commit_message>
<xml_diff>
--- a/paper/main_v2.docx
+++ b/paper/main_v2.docx
@@ -53,6 +53,11 @@
         <w:t xml:space="preserve">tool-channel compliance, source reliability, machine behaviour, AI safety, instruction hierarchy, tool use, large language models</w:t>
       </w:r>
     </w:p>
+    <w:p>
+      <w:r>
+        <w:br w:type="page"/>
+      </w:r>
+    </w:p>
     <w:bookmarkEnd w:id="9"/>
     <w:bookmarkStart w:id="13" w:name="main"/>
     <w:p>
@@ -68,7 +73,7 @@
         <w:pStyle w:val="FirstParagraph"/>
       </w:pPr>
       <w:r>
-        <w:t xml:space="preserve">Every frontier language model in our nine-model panel correctly identifies a fabricated institutional document as fabricated when asked, yet operationalises the same document as authoritative on roughly one trial in three when the content arrives through a model-initiated tool call, against a 1.5 per cent floor on byte-identical content delivered as a user instruction</w:t>
+        <w:t xml:space="preserve">Frontier language models increasingly operate as tool-using agents that retrieve documents and act on what they return, so a growing share of the content a model treats as authoritative reaches it through a tool call without passing a human reader</w:t>
       </w:r>
       <w:hyperlink w:anchor="ref-greshake2023not">
         <w:r>
@@ -95,7 +100,34 @@
         </w:r>
       </w:hyperlink>
       <w:r>
-        <w:t xml:space="preserve">. The compliance tracks the channel the content arrived through and not what the model reports believing about the source, a pattern we refer to descriptively as</w:t>
+        <w:t xml:space="preserve">. A system that weights information sensibly should accept a claim in proportion to how reliable it judges the claim’s source to be, a premise that safety training and agent benchmarks rely on</w:t>
+      </w:r>
+      <w:hyperlink w:anchor="ref-wallace2024instruction">
+        <w:r>
+          <w:rPr>
+            <w:rStyle w:val="Hyperlink"/>
+            <w:vertAlign w:val="superscript"/>
+          </w:rPr>
+          <w:t xml:space="preserve">3</w:t>
+        </w:r>
+      </w:hyperlink>
+      <w:r>
+        <w:rPr>
+          <w:vertAlign w:val="superscript"/>
+        </w:rPr>
+        <w:t xml:space="preserve">,</w:t>
+      </w:r>
+      <w:hyperlink w:anchor="ref-openai2024modelspec">
+        <w:r>
+          <w:rPr>
+            <w:rStyle w:val="Hyperlink"/>
+            <w:vertAlign w:val="superscript"/>
+          </w:rPr>
+          <w:t xml:space="preserve">4</w:t>
+        </w:r>
+      </w:hyperlink>
+      <w:r>
+        <w:t xml:space="preserve">. Whether that premise governs content a model receives through its own tool call, and not only content the user provides, has not been tested directly. Here we show that every frontier model we test identifies a fabricated institutional document as fabricated when asked, yet acts on the same document as authoritative on roughly one trial in three when the content arrives through a tool return, against a 1.5 per cent floor when byte-identical content is delivered as a user instruction, a dissociation between what a model judges and what it does that we refer to descriptively as</w:t>
       </w:r>
       <w:r>
         <w:t xml:space="preserve"> </w:t>
@@ -108,7 +140,7 @@
         <w:t xml:space="preserve">authority laundering</w:t>
       </w:r>
       <w:r>
-        <w:t xml:space="preserve">. Because the dissociation pairs an accurate stated assessment with behaviour that contradicts it, it raises a question that runs through both the cognitive and the safety literatures on language models: when a model’s compliance varies with the source of a claim, is the variation a rational response to learned source-reliability beliefs, or a heuristic that operates independently of what the model itself reports believing</w:t>
+        <w:t xml:space="preserve">. Because the compliance tracks the channel the content arrived through and not what the model reports believing about the source, it raises a question that runs through the cognitive and safety literatures alike, whether the channel-varying compliance is a rational response to learned source-reliability beliefs or a heuristic operating independently of what the model itself reports believing</w:t>
       </w:r>
       <w:hyperlink w:anchor="ref-steyvers2025what">
         <w:r>
@@ -116,7 +148,7 @@
             <w:rStyle w:val="Hyperlink"/>
             <w:vertAlign w:val="superscript"/>
           </w:rPr>
-          <w:t xml:space="preserve">3</w:t>
+          <w:t xml:space="preserve">5</w:t>
         </w:r>
       </w:hyperlink>
       <w:r>
@@ -131,11 +163,11 @@
             <w:rStyle w:val="Hyperlink"/>
             <w:vertAlign w:val="superscript"/>
           </w:rPr>
-          <w:t xml:space="preserve">4</w:t>
-        </w:r>
-      </w:hyperlink>
-      <w:r>
-        <w:t xml:space="preserve">? The present paper develops that question into a measurable test, in which the model’s own stated reliability assessment supplies the normative benchmark against which its compliance behaviour is scored, and applies the test across nine production models from three frontier laboratories.</w:t>
+          <w:t xml:space="preserve">6</w:t>
+        </w:r>
+      </w:hyperlink>
+      <w:r>
+        <w:t xml:space="preserve">, which we develop into a measurable test scored against the model’s own stated reliability.</w:t>
       </w:r>
     </w:p>
     <w:p>
@@ -151,7 +183,7 @@
             <w:rStyle w:val="Hyperlink"/>
             <w:vertAlign w:val="superscript"/>
           </w:rPr>
-          <w:t xml:space="preserve">5</w:t>
+          <w:t xml:space="preserve">7</w:t>
         </w:r>
       </w:hyperlink>
       <w:r>
@@ -163,7 +195,7 @@
             <w:rStyle w:val="Hyperlink"/>
             <w:vertAlign w:val="superscript"/>
           </w:rPr>
-          <w:t xml:space="preserve">6</w:t>
+          <w:t xml:space="preserve">8</w:t>
         </w:r>
       </w:hyperlink>
       <w:r>
@@ -175,7 +207,7 @@
             <w:rStyle w:val="Hyperlink"/>
             <w:vertAlign w:val="superscript"/>
           </w:rPr>
-          <w:t xml:space="preserve">7</w:t>
+          <w:t xml:space="preserve">9</w:t>
         </w:r>
       </w:hyperlink>
       <w:r>
@@ -190,7 +222,7 @@
             <w:rStyle w:val="Hyperlink"/>
             <w:vertAlign w:val="superscript"/>
           </w:rPr>
-          <w:t xml:space="preserve">8</w:t>
+          <w:t xml:space="preserve">10</w:t>
         </w:r>
       </w:hyperlink>
       <w:r>
@@ -341,49 +373,49 @@
             <w:rStyle w:val="Hyperlink"/>
             <w:vertAlign w:val="superscript"/>
           </w:rPr>
+          <w:t xml:space="preserve">3</w:t>
+        </w:r>
+      </w:hyperlink>
+      <w:r>
+        <w:t xml:space="preserve">, holds across all three laboratories with per-model susceptibility spanning more than 60 percentage points, and is consistent with a shared inductive bias acquired during instruction-tuning and reinforcement learning from human feedback (RLHF) in which retrieval-channel surfaces are weighted as institutional-grade sources at training time</w:t>
+      </w:r>
+      <w:hyperlink w:anchor="ref-petty1986elaboration">
+        <w:r>
+          <w:rPr>
+            <w:rStyle w:val="Hyperlink"/>
+            <w:vertAlign w:val="superscript"/>
+          </w:rPr>
           <w:t xml:space="preserve">9</w:t>
         </w:r>
       </w:hyperlink>
       <w:r>
-        <w:t xml:space="preserve">, holds across all three laboratories with per-model susceptibility spanning more than 60 percentage points, and is consistent with a shared inductive bias acquired during instruction-tuning and reinforcement learning from human feedback (RLHF) in which retrieval-channel surfaces are weighted as institutional-grade sources at training time</w:t>
-      </w:r>
-      <w:hyperlink w:anchor="ref-petty1986elaboration">
+        <w:rPr>
+          <w:vertAlign w:val="superscript"/>
+        </w:rPr>
+        <w:t xml:space="preserve">,</w:t>
+      </w:r>
+      <w:hyperlink w:anchor="ref-bai2022constitutional">
         <w:r>
           <w:rPr>
             <w:rStyle w:val="Hyperlink"/>
             <w:vertAlign w:val="superscript"/>
           </w:rPr>
-          <w:t xml:space="preserve">7</w:t>
+          <w:t xml:space="preserve">11</w:t>
         </w:r>
       </w:hyperlink>
       <w:r>
         <w:rPr>
           <w:vertAlign w:val="superscript"/>
         </w:rPr>
-        <w:t xml:space="preserve">,</w:t>
-      </w:r>
-      <w:hyperlink w:anchor="ref-bai2022constitutional">
+        <w:t xml:space="preserve">–</w:t>
+      </w:r>
+      <w:hyperlink w:anchor="ref-tversky1974judgment">
         <w:r>
           <w:rPr>
             <w:rStyle w:val="Hyperlink"/>
             <w:vertAlign w:val="superscript"/>
           </w:rPr>
-          <w:t xml:space="preserve">10</w:t>
-        </w:r>
-      </w:hyperlink>
-      <w:r>
-        <w:rPr>
-          <w:vertAlign w:val="superscript"/>
-        </w:rPr>
-        <w:t xml:space="preserve">–</w:t>
-      </w:r>
-      <w:hyperlink w:anchor="ref-tversky1974judgment">
-        <w:r>
-          <w:rPr>
-            <w:rStyle w:val="Hyperlink"/>
-            <w:vertAlign w:val="superscript"/>
-          </w:rPr>
-          <w:t xml:space="preserve">12</w:t>
+          <w:t xml:space="preserve">13</w:t>
         </w:r>
       </w:hyperlink>
       <w:r>
@@ -840,7 +872,7 @@
             <w:rStyle w:val="Hyperlink"/>
             <w:vertAlign w:val="superscript"/>
           </w:rPr>
-          <w:t xml:space="preserve">9</w:t>
+          <w:t xml:space="preserve">3</w:t>
         </w:r>
       </w:hyperlink>
       <w:r>
@@ -855,7 +887,7 @@
             <w:rStyle w:val="Hyperlink"/>
             <w:vertAlign w:val="superscript"/>
           </w:rPr>
-          <w:t xml:space="preserve">13</w:t>
+          <w:t xml:space="preserve">4</w:t>
         </w:r>
       </w:hyperlink>
       <w:r>
@@ -1234,7 +1266,7 @@
             <w:rStyle w:val="Hyperlink"/>
             <w:vertAlign w:val="superscript"/>
           </w:rPr>
-          <w:t xml:space="preserve">9</w:t>
+          <w:t xml:space="preserve">3</w:t>
         </w:r>
       </w:hyperlink>
       <w:r>
@@ -1323,7 +1355,7 @@
             <w:rStyle w:val="Hyperlink"/>
             <w:vertAlign w:val="superscript"/>
           </w:rPr>
-          <w:t xml:space="preserve">10</w:t>
+          <w:t xml:space="preserve">11</w:t>
         </w:r>
       </w:hyperlink>
       <w:r>
@@ -1338,7 +1370,7 @@
             <w:rStyle w:val="Hyperlink"/>
             <w:vertAlign w:val="superscript"/>
           </w:rPr>
-          <w:t xml:space="preserve">11</w:t>
+          <w:t xml:space="preserve">12</w:t>
         </w:r>
       </w:hyperlink>
       <w:r>
@@ -1602,7 +1634,7 @@
             <w:rStyle w:val="Hyperlink"/>
             <w:vertAlign w:val="superscript"/>
           </w:rPr>
-          <w:t xml:space="preserve">12</w:t>
+          <w:t xml:space="preserve">13</w:t>
         </w:r>
       </w:hyperlink>
       <w:r>
@@ -2374,7 +2406,7 @@
             <w:rStyle w:val="Hyperlink"/>
             <w:vertAlign w:val="superscript"/>
           </w:rPr>
-          <w:t xml:space="preserve">9</w:t>
+          <w:t xml:space="preserve">3</w:t>
         </w:r>
       </w:hyperlink>
       <w:r>
@@ -2495,7 +2527,7 @@
             <w:rStyle w:val="Hyperlink"/>
             <w:vertAlign w:val="superscript"/>
           </w:rPr>
-          <w:t xml:space="preserve">5</w:t>
+          <w:t xml:space="preserve">7</w:t>
         </w:r>
       </w:hyperlink>
       <w:r>
@@ -2552,7 +2584,7 @@
             <w:rStyle w:val="Hyperlink"/>
             <w:vertAlign w:val="superscript"/>
           </w:rPr>
-          <w:t xml:space="preserve">10</w:t>
+          <w:t xml:space="preserve">11</w:t>
         </w:r>
       </w:hyperlink>
       <w:r>
@@ -2567,7 +2599,7 @@
             <w:rStyle w:val="Hyperlink"/>
             <w:vertAlign w:val="superscript"/>
           </w:rPr>
-          <w:t xml:space="preserve">11</w:t>
+          <w:t xml:space="preserve">12</w:t>
         </w:r>
       </w:hyperlink>
       <w:r>
@@ -2591,7 +2623,7 @@
             <w:rStyle w:val="Hyperlink"/>
             <w:vertAlign w:val="superscript"/>
           </w:rPr>
-          <w:t xml:space="preserve">5</w:t>
+          <w:t xml:space="preserve">7</w:t>
         </w:r>
       </w:hyperlink>
       <w:r>
@@ -2606,7 +2638,7 @@
             <w:rStyle w:val="Hyperlink"/>
             <w:vertAlign w:val="superscript"/>
           </w:rPr>
-          <w:t xml:space="preserve">7</w:t>
+          <w:t xml:space="preserve">9</w:t>
         </w:r>
       </w:hyperlink>
       <w:r>
@@ -2621,7 +2653,7 @@
             <w:rStyle w:val="Hyperlink"/>
             <w:vertAlign w:val="superscript"/>
           </w:rPr>
-          <w:t xml:space="preserve">12</w:t>
+          <w:t xml:space="preserve">13</w:t>
         </w:r>
       </w:hyperlink>
       <w:r>
@@ -2668,7 +2700,7 @@
             <w:rStyle w:val="Hyperlink"/>
             <w:vertAlign w:val="superscript"/>
           </w:rPr>
-          <w:t xml:space="preserve">4</w:t>
+          <w:t xml:space="preserve">6</w:t>
         </w:r>
       </w:hyperlink>
       <w:r>
@@ -2710,7 +2742,7 @@
             <w:rStyle w:val="Hyperlink"/>
             <w:vertAlign w:val="superscript"/>
           </w:rPr>
-          <w:t xml:space="preserve">9</w:t>
+          <w:t xml:space="preserve">3</w:t>
         </w:r>
       </w:hyperlink>
       <w:r>
@@ -2826,7 +2858,7 @@
             <w:rStyle w:val="Hyperlink"/>
             <w:vertAlign w:val="superscript"/>
           </w:rPr>
-          <w:t xml:space="preserve">6</w:t>
+          <w:t xml:space="preserve">8</w:t>
         </w:r>
       </w:hyperlink>
       <w:r>
@@ -2905,7 +2937,7 @@
             <w:rStyle w:val="Hyperlink"/>
             <w:vertAlign w:val="superscript"/>
           </w:rPr>
-          <w:t xml:space="preserve">3</w:t>
+          <w:t xml:space="preserve">5</w:t>
         </w:r>
       </w:hyperlink>
       <w:r>
@@ -3030,7 +3062,7 @@
             <w:rStyle w:val="Hyperlink"/>
             <w:vertAlign w:val="superscript"/>
           </w:rPr>
-          <w:t xml:space="preserve">8</w:t>
+          <w:t xml:space="preserve">10</w:t>
         </w:r>
       </w:hyperlink>
       <w:r>
@@ -3216,7 +3248,7 @@
             <w:rStyle w:val="Hyperlink"/>
             <w:vertAlign w:val="superscript"/>
           </w:rPr>
-          <w:t xml:space="preserve">10</w:t>
+          <w:t xml:space="preserve">11</w:t>
         </w:r>
       </w:hyperlink>
       <w:r>
@@ -6769,7 +6801,7 @@
       </w:r>
     </w:p>
     <w:bookmarkEnd w:id="58"/>
-    <w:bookmarkStart w:id="60" w:name="ref-steyvers2025what"/>
+    <w:bookmarkStart w:id="60" w:name="ref-wallace2024instruction"/>
     <w:p>
       <w:pPr>
         <w:pStyle w:val="Bibliography"/>
@@ -6784,7 +6816,7 @@
         <w:t xml:space="preserve">	</w:t>
       </w:r>
       <w:r>
-        <w:t xml:space="preserve">Steyvers, M.</w:t>
+        <w:t xml:space="preserve">Wallace, E.</w:t>
       </w:r>
       <w:r>
         <w:t xml:space="preserve"> </w:t>
@@ -6797,18 +6829,82 @@
         <w:t xml:space="preserve">et al.</w:t>
       </w:r>
       <w:r>
-        <w:t xml:space="preserve"> </w:t>
+        <w:t xml:space="preserve"> The instruction hierarchy: Training</w:t>
+      </w:r>
+      <w:r>
+        <w:t xml:space="preserve"> </w:t>
+      </w:r>
+      <w:r>
+        <w:t xml:space="preserve">LLMs</w:t>
+      </w:r>
+      <w:r>
+        <w:t xml:space="preserve"> </w:t>
+      </w:r>
+      <w:r>
+        <w:t xml:space="preserve">to prioritize privileged instructions. (2024) doi:</w:t>
       </w:r>
       <w:hyperlink r:id="rId59">
         <w:r>
           <w:rPr>
             <w:rStyle w:val="Hyperlink"/>
           </w:rPr>
-          <w:t xml:space="preserve">What large language models know and what people think they know</w:t>
+          <w:t xml:space="preserve">10.48550/arXiv.2404.13208</w:t>
         </w:r>
       </w:hyperlink>
       <w:r>
         <w:t xml:space="preserve">.</w:t>
+      </w:r>
+    </w:p>
+    <w:bookmarkEnd w:id="60"/>
+    <w:bookmarkStart w:id="62" w:name="ref-openai2024modelspec"/>
+    <w:p>
+      <w:pPr>
+        <w:pStyle w:val="Bibliography"/>
+      </w:pPr>
+      <w:r>
+        <w:t xml:space="preserve">4.</w:t>
+      </w:r>
+      <w:r>
+        <w:t xml:space="preserve"> </w:t>
+      </w:r>
+      <w:r>
+        <w:t xml:space="preserve">	</w:t>
+      </w:r>
+      <w:r>
+        <w:t xml:space="preserve">OpenAI.</w:t>
+      </w:r>
+      <w:r>
+        <w:t xml:space="preserve"> </w:t>
+      </w:r>
+      <w:hyperlink r:id="rId61">
+        <w:r>
+          <w:rPr>
+            <w:rStyle w:val="Hyperlink"/>
+          </w:rPr>
+          <w:t xml:space="preserve">OpenAI model spec</w:t>
+        </w:r>
+      </w:hyperlink>
+      <w:r>
+        <w:t xml:space="preserve">. (2024).</w:t>
+      </w:r>
+    </w:p>
+    <w:bookmarkEnd w:id="62"/>
+    <w:bookmarkStart w:id="64" w:name="ref-steyvers2025what"/>
+    <w:p>
+      <w:pPr>
+        <w:pStyle w:val="Bibliography"/>
+      </w:pPr>
+      <w:r>
+        <w:t xml:space="preserve">5.</w:t>
+      </w:r>
+      <w:r>
+        <w:t xml:space="preserve"> </w:t>
+      </w:r>
+      <w:r>
+        <w:t xml:space="preserve">	</w:t>
+      </w:r>
+      <w:r>
+        <w:t xml:space="preserve">Steyvers, M.</w:t>
       </w:r>
       <w:r>
         <w:t xml:space="preserve"> </w:t>
@@ -6818,6 +6914,30 @@
           <w:i/>
           <w:iCs/>
         </w:rPr>
+        <w:t xml:space="preserve">et al.</w:t>
+      </w:r>
+      <w:r>
+        <w:t xml:space="preserve"> </w:t>
+      </w:r>
+      <w:hyperlink r:id="rId63">
+        <w:r>
+          <w:rPr>
+            <w:rStyle w:val="Hyperlink"/>
+          </w:rPr>
+          <w:t xml:space="preserve">What large language models know and what people think they know</w:t>
+        </w:r>
+      </w:hyperlink>
+      <w:r>
+        <w:t xml:space="preserve">.</w:t>
+      </w:r>
+      <w:r>
+        <w:t xml:space="preserve"> </w:t>
+      </w:r>
+      <w:r>
+        <w:rPr>
+          <w:i/>
+          <w:iCs/>
+        </w:rPr>
         <w:t xml:space="preserve">Nature Machine Intelligence</w:t>
       </w:r>
       <w:r>
@@ -6834,14 +6954,14 @@
         <w:t xml:space="preserve">, 221–231 (2025).</w:t>
       </w:r>
     </w:p>
-    <w:bookmarkEnd w:id="60"/>
-    <w:bookmarkStart w:id="62" w:name="ref-griot2025metacognition"/>
+    <w:bookmarkEnd w:id="64"/>
+    <w:bookmarkStart w:id="66" w:name="ref-griot2025metacognition"/>
     <w:p>
       <w:pPr>
         <w:pStyle w:val="Bibliography"/>
       </w:pPr>
       <w:r>
-        <w:t xml:space="preserve">4.</w:t>
+        <w:t xml:space="preserve">6.</w:t>
       </w:r>
       <w:r>
         <w:t xml:space="preserve"> </w:t>
@@ -6855,7 +6975,7 @@
       <w:r>
         <w:t xml:space="preserve"> </w:t>
       </w:r>
-      <w:hyperlink r:id="rId61">
+      <w:hyperlink r:id="rId65">
         <w:r>
           <w:rPr>
             <w:rStyle w:val="Hyperlink"/>
@@ -6890,14 +7010,14 @@
         <w:t xml:space="preserve">, 642 (2025).</w:t>
       </w:r>
     </w:p>
-    <w:bookmarkEnd w:id="62"/>
-    <w:bookmarkStart w:id="64" w:name="ref-germani2025source"/>
+    <w:bookmarkEnd w:id="66"/>
+    <w:bookmarkStart w:id="68" w:name="ref-germani2025source"/>
     <w:p>
       <w:pPr>
         <w:pStyle w:val="Bibliography"/>
       </w:pPr>
       <w:r>
-        <w:t xml:space="preserve">5.</w:t>
+        <w:t xml:space="preserve">7.</w:t>
       </w:r>
       <w:r>
         <w:t xml:space="preserve"> </w:t>
@@ -6911,7 +7031,7 @@
       <w:r>
         <w:t xml:space="preserve"> </w:t>
       </w:r>
-      <w:hyperlink r:id="rId63">
+      <w:hyperlink r:id="rId67">
         <w:r>
           <w:rPr>
             <w:rStyle w:val="Hyperlink"/>
@@ -6946,14 +7066,14 @@
         <w:t xml:space="preserve">, eadz2924 (2025).</w:t>
       </w:r>
     </w:p>
-    <w:bookmarkEnd w:id="64"/>
-    <w:bookmarkStart w:id="66" w:name="ref-rahwan2019machine"/>
+    <w:bookmarkEnd w:id="68"/>
+    <w:bookmarkStart w:id="70" w:name="ref-rahwan2019machine"/>
     <w:p>
       <w:pPr>
         <w:pStyle w:val="Bibliography"/>
       </w:pPr>
       <w:r>
-        <w:t xml:space="preserve">6.</w:t>
+        <w:t xml:space="preserve">8.</w:t>
       </w:r>
       <w:r>
         <w:t xml:space="preserve"> </w:t>
@@ -6977,7 +7097,7 @@
       <w:r>
         <w:t xml:space="preserve"> </w:t>
       </w:r>
-      <w:hyperlink r:id="rId65">
+      <w:hyperlink r:id="rId69">
         <w:r>
           <w:rPr>
             <w:rStyle w:val="Hyperlink"/>
@@ -7012,14 +7132,14 @@
         <w:t xml:space="preserve">, 477–486 (2019).</w:t>
       </w:r>
     </w:p>
-    <w:bookmarkEnd w:id="66"/>
-    <w:bookmarkStart w:id="68" w:name="ref-petty1986elaboration"/>
+    <w:bookmarkEnd w:id="70"/>
+    <w:bookmarkStart w:id="72" w:name="ref-petty1986elaboration"/>
     <w:p>
       <w:pPr>
         <w:pStyle w:val="Bibliography"/>
       </w:pPr>
       <w:r>
-        <w:t xml:space="preserve">7.</w:t>
+        <w:t xml:space="preserve">9.</w:t>
       </w:r>
       <w:r>
         <w:t xml:space="preserve"> </w:t>
@@ -7033,7 +7153,7 @@
       <w:r>
         <w:t xml:space="preserve"> </w:t>
       </w:r>
-      <w:hyperlink r:id="rId67">
+      <w:hyperlink r:id="rId71">
         <w:r>
           <w:rPr>
             <w:rStyle w:val="Hyperlink"/>
@@ -7068,14 +7188,14 @@
         <w:t xml:space="preserve">, 123–205 (1986).</w:t>
       </w:r>
     </w:p>
-    <w:bookmarkEnd w:id="68"/>
-    <w:bookmarkStart w:id="70" w:name="ref-steyvers2022bayesian"/>
+    <w:bookmarkEnd w:id="72"/>
+    <w:bookmarkStart w:id="74" w:name="ref-steyvers2022bayesian"/>
     <w:p>
       <w:pPr>
         <w:pStyle w:val="Bibliography"/>
       </w:pPr>
       <w:r>
-        <w:t xml:space="preserve">8.</w:t>
+        <w:t xml:space="preserve">10.</w:t>
       </w:r>
       <w:r>
         <w:t xml:space="preserve"> </w:t>
@@ -7089,7 +7209,7 @@
       <w:r>
         <w:t xml:space="preserve"> </w:t>
       </w:r>
-      <w:hyperlink r:id="rId69">
+      <w:hyperlink r:id="rId73">
         <w:r>
           <w:rPr>
             <w:rStyle w:val="Hyperlink"/>
@@ -7142,14 +7262,14 @@
         <w:t xml:space="preserve">, e2111547119 (2022).</w:t>
       </w:r>
     </w:p>
-    <w:bookmarkEnd w:id="70"/>
-    <w:bookmarkStart w:id="72" w:name="ref-wallace2024instruction"/>
+    <w:bookmarkEnd w:id="74"/>
+    <w:bookmarkStart w:id="76" w:name="ref-bai2022constitutional"/>
     <w:p>
       <w:pPr>
         <w:pStyle w:val="Bibliography"/>
       </w:pPr>
       <w:r>
-        <w:t xml:space="preserve">9.</w:t>
+        <w:t xml:space="preserve">11.</w:t>
       </w:r>
       <w:r>
         <w:t xml:space="preserve"> </w:t>
@@ -7158,7 +7278,7 @@
         <w:t xml:space="preserve">	</w:t>
       </w:r>
       <w:r>
-        <w:t xml:space="preserve">Wallace, E.</w:t>
+        <w:t xml:space="preserve">Bai, Y.</w:t>
       </w:r>
       <w:r>
         <w:t xml:space="preserve"> </w:t>
@@ -7171,40 +7291,49 @@
         <w:t xml:space="preserve">et al.</w:t>
       </w:r>
       <w:r>
-        <w:t xml:space="preserve"> The instruction hierarchy: Training</w:t>
-      </w:r>
-      <w:r>
-        <w:t xml:space="preserve"> </w:t>
-      </w:r>
-      <w:r>
-        <w:t xml:space="preserve">LLMs</w:t>
-      </w:r>
-      <w:r>
-        <w:t xml:space="preserve"> </w:t>
-      </w:r>
-      <w:r>
-        <w:t xml:space="preserve">to prioritize privileged instructions. (2024) doi:</w:t>
-      </w:r>
-      <w:hyperlink r:id="rId71">
-        <w:r>
-          <w:rPr>
-            <w:rStyle w:val="Hyperlink"/>
-          </w:rPr>
-          <w:t xml:space="preserve">10.48550/arXiv.2404.13208</w:t>
+        <w:t xml:space="preserve"> Constitutional</w:t>
+      </w:r>
+      <w:r>
+        <w:t xml:space="preserve"> </w:t>
+      </w:r>
+      <w:r>
+        <w:t xml:space="preserve">AI</w:t>
+      </w:r>
+      <w:r>
+        <w:t xml:space="preserve">: Harmlessness from</w:t>
+      </w:r>
+      <w:r>
+        <w:t xml:space="preserve"> </w:t>
+      </w:r>
+      <w:r>
+        <w:t xml:space="preserve">AI</w:t>
+      </w:r>
+      <w:r>
+        <w:t xml:space="preserve"> </w:t>
+      </w:r>
+      <w:r>
+        <w:t xml:space="preserve">feedback. (2022) doi:</w:t>
+      </w:r>
+      <w:hyperlink r:id="rId75">
+        <w:r>
+          <w:rPr>
+            <w:rStyle w:val="Hyperlink"/>
+          </w:rPr>
+          <w:t xml:space="preserve">10.48550/arXiv.2212.08073</w:t>
         </w:r>
       </w:hyperlink>
       <w:r>
         <w:t xml:space="preserve">.</w:t>
       </w:r>
     </w:p>
-    <w:bookmarkEnd w:id="72"/>
-    <w:bookmarkStart w:id="74" w:name="ref-bai2022constitutional"/>
+    <w:bookmarkEnd w:id="76"/>
+    <w:bookmarkStart w:id="78" w:name="ref-ouyang2022training"/>
     <w:p>
       <w:pPr>
         <w:pStyle w:val="Bibliography"/>
       </w:pPr>
       <w:r>
-        <w:t xml:space="preserve">10.</w:t>
+        <w:t xml:space="preserve">12.</w:t>
       </w:r>
       <w:r>
         <w:t xml:space="preserve"> </w:t>
@@ -7213,7 +7342,7 @@
         <w:t xml:space="preserve">	</w:t>
       </w:r>
       <w:r>
-        <w:t xml:space="preserve">Bai, Y.</w:t>
+        <w:t xml:space="preserve">Ouyang, L.</w:t>
       </w:r>
       <w:r>
         <w:t xml:space="preserve"> </w:t>
@@ -7226,58 +7355,18 @@
         <w:t xml:space="preserve">et al.</w:t>
       </w:r>
       <w:r>
-        <w:t xml:space="preserve"> Constitutional</w:t>
-      </w:r>
-      <w:r>
-        <w:t xml:space="preserve"> </w:t>
-      </w:r>
-      <w:r>
-        <w:t xml:space="preserve">AI</w:t>
-      </w:r>
-      <w:r>
-        <w:t xml:space="preserve">: Harmlessness from</w:t>
-      </w:r>
-      <w:r>
-        <w:t xml:space="preserve"> </w:t>
-      </w:r>
-      <w:r>
-        <w:t xml:space="preserve">AI</w:t>
-      </w:r>
-      <w:r>
-        <w:t xml:space="preserve"> </w:t>
-      </w:r>
-      <w:r>
-        <w:t xml:space="preserve">feedback. (2022) doi:</w:t>
-      </w:r>
-      <w:hyperlink r:id="rId73">
-        <w:r>
-          <w:rPr>
-            <w:rStyle w:val="Hyperlink"/>
-          </w:rPr>
-          <w:t xml:space="preserve">10.48550/arXiv.2212.08073</w:t>
-        </w:r>
-      </w:hyperlink>
-      <w:r>
-        <w:t xml:space="preserve">.</w:t>
-      </w:r>
-    </w:p>
-    <w:bookmarkEnd w:id="74"/>
-    <w:bookmarkStart w:id="76" w:name="ref-ouyang2022training"/>
-    <w:p>
-      <w:pPr>
-        <w:pStyle w:val="Bibliography"/>
-      </w:pPr>
-      <w:r>
-        <w:t xml:space="preserve">11.</w:t>
-      </w:r>
-      <w:r>
-        <w:t xml:space="preserve"> </w:t>
-      </w:r>
-      <w:r>
-        <w:t xml:space="preserve">	</w:t>
-      </w:r>
-      <w:r>
-        <w:t xml:space="preserve">Ouyang, L.</w:t>
+        <w:t xml:space="preserve"> </w:t>
+      </w:r>
+      <w:hyperlink r:id="rId77">
+        <w:r>
+          <w:rPr>
+            <w:rStyle w:val="Hyperlink"/>
+          </w:rPr>
+          <w:t xml:space="preserve">Training language models to follow instructions with human feedback</w:t>
+        </w:r>
+      </w:hyperlink>
+      <w:r>
+        <w:t xml:space="preserve">. in</w:t>
       </w:r>
       <w:r>
         <w:t xml:space="preserve"> </w:t>
@@ -7287,93 +7376,69 @@
           <w:i/>
           <w:iCs/>
         </w:rPr>
-        <w:t xml:space="preserve">et al.</w:t>
-      </w:r>
-      <w:r>
-        <w:t xml:space="preserve"> </w:t>
-      </w:r>
-      <w:hyperlink r:id="rId75">
-        <w:r>
-          <w:rPr>
-            <w:rStyle w:val="Hyperlink"/>
-          </w:rPr>
-          <w:t xml:space="preserve">Training language models to follow instructions with human feedback</w:t>
-        </w:r>
-      </w:hyperlink>
-      <w:r>
-        <w:t xml:space="preserve">. in</w:t>
-      </w:r>
-      <w:r>
-        <w:t xml:space="preserve"> </w:t>
+        <w:t xml:space="preserve">Advances in neural information processing systems (</w:t>
       </w:r>
       <w:r>
         <w:rPr>
           <w:i/>
           <w:iCs/>
         </w:rPr>
-        <w:t xml:space="preserve">Advances in neural information processing systems (</w:t>
+        <w:t xml:space="preserve">NeurIPS</w:t>
       </w:r>
       <w:r>
         <w:rPr>
           <w:i/>
           <w:iCs/>
         </w:rPr>
-        <w:t xml:space="preserve">NeurIPS</w:t>
+        <w:t xml:space="preserve">)</w:t>
+      </w:r>
+      <w:r>
+        <w:t xml:space="preserve"> </w:t>
+      </w:r>
+      <w:r>
+        <w:t xml:space="preserve">vol. 35 27730–27744 (2022).</w:t>
+      </w:r>
+    </w:p>
+    <w:bookmarkEnd w:id="78"/>
+    <w:bookmarkStart w:id="80" w:name="ref-tversky1974judgment"/>
+    <w:p>
+      <w:pPr>
+        <w:pStyle w:val="Bibliography"/>
+      </w:pPr>
+      <w:r>
+        <w:t xml:space="preserve">13.</w:t>
+      </w:r>
+      <w:r>
+        <w:t xml:space="preserve"> </w:t>
+      </w:r>
+      <w:r>
+        <w:t xml:space="preserve">	</w:t>
+      </w:r>
+      <w:r>
+        <w:t xml:space="preserve">Tversky, A. &amp; Kahneman, D.</w:t>
+      </w:r>
+      <w:r>
+        <w:t xml:space="preserve"> </w:t>
+      </w:r>
+      <w:hyperlink r:id="rId79">
+        <w:r>
+          <w:rPr>
+            <w:rStyle w:val="Hyperlink"/>
+          </w:rPr>
+          <w:t xml:space="preserve">Judgment under uncertainty: Heuristics and biases</w:t>
+        </w:r>
+      </w:hyperlink>
+      <w:r>
+        <w:t xml:space="preserve">.</w:t>
+      </w:r>
+      <w:r>
+        <w:t xml:space="preserve"> </w:t>
       </w:r>
       <w:r>
         <w:rPr>
           <w:i/>
           <w:iCs/>
         </w:rPr>
-        <w:t xml:space="preserve">)</w:t>
-      </w:r>
-      <w:r>
-        <w:t xml:space="preserve"> </w:t>
-      </w:r>
-      <w:r>
-        <w:t xml:space="preserve">vol. 35 27730–27744 (2022).</w:t>
-      </w:r>
-    </w:p>
-    <w:bookmarkEnd w:id="76"/>
-    <w:bookmarkStart w:id="78" w:name="ref-tversky1974judgment"/>
-    <w:p>
-      <w:pPr>
-        <w:pStyle w:val="Bibliography"/>
-      </w:pPr>
-      <w:r>
-        <w:t xml:space="preserve">12.</w:t>
-      </w:r>
-      <w:r>
-        <w:t xml:space="preserve"> </w:t>
-      </w:r>
-      <w:r>
-        <w:t xml:space="preserve">	</w:t>
-      </w:r>
-      <w:r>
-        <w:t xml:space="preserve">Tversky, A. &amp; Kahneman, D.</w:t>
-      </w:r>
-      <w:r>
-        <w:t xml:space="preserve"> </w:t>
-      </w:r>
-      <w:hyperlink r:id="rId77">
-        <w:r>
-          <w:rPr>
-            <w:rStyle w:val="Hyperlink"/>
-          </w:rPr>
-          <w:t xml:space="preserve">Judgment under uncertainty: Heuristics and biases</w:t>
-        </w:r>
-      </w:hyperlink>
-      <w:r>
-        <w:t xml:space="preserve">.</w:t>
-      </w:r>
-      <w:r>
-        <w:t xml:space="preserve"> </w:t>
-      </w:r>
-      <w:r>
-        <w:rPr>
-          <w:i/>
-          <w:iCs/>
-        </w:rPr>
         <w:t xml:space="preserve">Science</w:t>
       </w:r>
       <w:r>
@@ -7388,39 +7453,6 @@
       </w:r>
       <w:r>
         <w:t xml:space="preserve">, 1124–1131 (1974).</w:t>
-      </w:r>
-    </w:p>
-    <w:bookmarkEnd w:id="78"/>
-    <w:bookmarkStart w:id="80" w:name="ref-openai2024modelspec"/>
-    <w:p>
-      <w:pPr>
-        <w:pStyle w:val="Bibliography"/>
-      </w:pPr>
-      <w:r>
-        <w:t xml:space="preserve">13.</w:t>
-      </w:r>
-      <w:r>
-        <w:t xml:space="preserve"> </w:t>
-      </w:r>
-      <w:r>
-        <w:t xml:space="preserve">	</w:t>
-      </w:r>
-      <w:r>
-        <w:t xml:space="preserve">OpenAI.</w:t>
-      </w:r>
-      <w:r>
-        <w:t xml:space="preserve"> </w:t>
-      </w:r>
-      <w:hyperlink r:id="rId79">
-        <w:r>
-          <w:rPr>
-            <w:rStyle w:val="Hyperlink"/>
-          </w:rPr>
-          <w:t xml:space="preserve">OpenAI model spec</w:t>
-        </w:r>
-      </w:hyperlink>
-      <w:r>
-        <w:t xml:space="preserve">. (2024).</w:t>
       </w:r>
     </w:p>
     <w:bookmarkEnd w:id="80"/>

</xml_diff>

<commit_message>
Wrap long underscore IDs in table cells so the Harm column no longer collides (template-level, scoped to longtables); move the per-laboratory table to Extended Data Table 1 and renumber the generational table to Table 3 for the 8 display-item cap; point Data and Code Availability at the public GitHub repo. Data unchanged; release verify 85/85.
</commit_message>
<xml_diff>
--- a/paper/main_v2.docx
+++ b/paper/main_v2.docx
@@ -1347,7 +1347,7 @@
         <w:pStyle w:val="BodyText"/>
       </w:pPr>
       <w:r>
-        <w:t xml:space="preserve">The gradient also manifests at the laboratory level (Google 57.8 per cent, OpenAI 29.3 per cent, Anthropic 21.0 per cent on tool return; Table 3) and reverses under the user-imperative condition, consistent with laboratory differences concentrating on channel-mediated acceptance while imperative-framed fabrications stay low across laboratories</w:t>
+        <w:t xml:space="preserve">The gradient also manifests at the laboratory level (Google 57.8 per cent, OpenAI 29.3 per cent, Anthropic 21.0 per cent on tool return; Extended Data Table 1) and reverses under the user-imperative condition, consistent with laboratory differences concentrating on channel-mediated acceptance while imperative-framed fabrications stay low across laboratories</w:t>
       </w:r>
       <w:hyperlink w:anchor="ref-bai2022constitutional">
         <w:r>
@@ -1466,7 +1466,7 @@
         <w:pStyle w:val="BodyText"/>
       </w:pPr>
       <w:r>
-        <w:t xml:space="preserve">A generational comparison within the Anthropic Opus family isolates the effect of an incremental safety-training update on matched scenarios (Fig. 3 and Table 4). Claude Opus 4.6 complies with tool-delivered fabrications on 26.7 per cent of trials across the 27-scenario corpus, whereas Opus 4.7, which shares the architecture and differs principally in post-training, complies on 11.9 per cent. The within-family hardening is largest on the adversarial-context subset (26.7 to 3.3 per cent, an 8.0-fold reduction) and smaller on the professional-context and consumer-context subsets where the user query does not surface harmful-intent cues, consistent with localising the post-training intervention to query-framing-cued refusal while leaving the broader channel-conditioned authority mechanism unchanged. Both Opus generations return</w:t>
+        <w:t xml:space="preserve">A generational comparison within the Anthropic Opus family isolates the effect of an incremental safety-training update on matched scenarios (Fig. 3 and Table 3). Claude Opus 4.6 complies with tool-delivered fabrications on 26.7 per cent of trials across the 27-scenario corpus, whereas Opus 4.7, which shares the architecture and differs principally in post-training, complies on 11.9 per cent. The within-family hardening is largest on the adversarial-context subset (26.7 to 3.3 per cent, an 8.0-fold reduction) and smaller on the professional-context and consumer-context subsets where the user query does not surface harmful-intent cues, consistent with localising the post-training intervention to query-framing-cued refusal while leaving the broader channel-conditioned authority mechanism unchanged. Both Opus generations return</w:t>
       </w:r>
       <w:r>
         <w:t xml:space="preserve"> </w:t>
@@ -3704,7 +3704,7 @@
         <w:t xml:space="preserve"> </w:t>
       </w:r>
       <w:r>
-        <w:t xml:space="preserve">two-sided under the observed binomial variance. An extended-replicate collection on the tool-return and user-imperative cells (15 additional replicates per model-scenario cell beyond the 5-replicate panel, collected for matched-pair construction) independently reproduces the headline contrast at three times the panel sample, with tool-return compliance of 31.9 per cent (1,161 of 3,644) against a user-imperative rate of 1.2 per cent (38 of 3,167), within one percentage point of the panel estimates. Generational within-family contrasts (Table 4) use exact paired McNemar’s tests</w:t>
+        <w:t xml:space="preserve">two-sided under the observed binomial variance. An extended-replicate collection on the tool-return and user-imperative cells (15 additional replicates per model-scenario cell beyond the 5-replicate panel, collected for matched-pair construction) independently reproduces the headline contrast at three times the panel sample, with tool-return compliance of 31.9 per cent (1,161 of 3,644) against a user-imperative rate of 1.2 per cent (38 of 3,167), within one percentage point of the panel estimates. Generational within-family contrasts (Table 3) use exact paired McNemar’s tests</w:t>
       </w:r>
       <w:hyperlink w:anchor="ref-mcnemar1947note">
         <w:r>
@@ -5723,13 +5723,13 @@
           <w:b/>
           <w:bCs/>
         </w:rPr>
-        <w:t xml:space="preserve">Table 3 | Per-laboratory pooled compliance on the tool-return condition.</w:t>
-      </w:r>
-      <w:r>
-        <w:t xml:space="preserve"> </w:t>
-      </w:r>
-      <w:r>
-        <w:t xml:space="preserve">Models are pooled within laboratory across the 27-scenario corpus at five replicates per cell.</w:t>
+        <w:t xml:space="preserve">Table 3 | Generational comparison within the Anthropic Opus family.</w:t>
+      </w:r>
+      <w:r>
+        <w:t xml:space="preserve"> </w:t>
+      </w:r>
+      <w:r>
+        <w:t xml:space="preserve">Identical scenarios, identical tool surface, and identical judge.</w:t>
       </w:r>
     </w:p>
     <w:tbl>
@@ -5754,42 +5754,46 @@
           <w:p>
             <w:pPr>
               <w:pStyle w:val="Compact"/>
-            </w:pPr>
-            <w:r>
-              <w:t xml:space="preserve">Laboratory</w:t>
-            </w:r>
-          </w:p>
-        </w:tc>
-        <w:tc>
-          <w:tcPr/>
-          <w:p>
-            <w:pPr>
-              <w:pStyle w:val="Compact"/>
-            </w:pPr>
-            <w:r>
-              <w:t xml:space="preserve">Models in panel</w:t>
-            </w:r>
-          </w:p>
-        </w:tc>
-        <w:tc>
-          <w:tcPr/>
-          <w:p>
-            <w:pPr>
-              <w:pStyle w:val="Compact"/>
-            </w:pPr>
-            <w:r>
-              <w:t xml:space="preserve">Tool-return compliance</w:t>
-            </w:r>
-          </w:p>
-        </w:tc>
-        <w:tc>
-          <w:tcPr/>
-          <w:p>
-            <w:pPr>
-              <w:pStyle w:val="Compact"/>
-            </w:pPr>
-            <w:r>
-              <w:t xml:space="preserve">n</w:t>
+              <w:jc w:val="left"/>
+            </w:pPr>
+            <w:r>
+              <w:t xml:space="preserve">Comparison</w:t>
+            </w:r>
+          </w:p>
+        </w:tc>
+        <w:tc>
+          <w:tcPr/>
+          <w:p>
+            <w:pPr>
+              <w:pStyle w:val="Compact"/>
+              <w:jc w:val="right"/>
+            </w:pPr>
+            <w:r>
+              <w:t xml:space="preserve">Opus 4.6</w:t>
+            </w:r>
+          </w:p>
+        </w:tc>
+        <w:tc>
+          <w:tcPr/>
+          <w:p>
+            <w:pPr>
+              <w:pStyle w:val="Compact"/>
+              <w:jc w:val="right"/>
+            </w:pPr>
+            <w:r>
+              <w:t xml:space="preserve">Opus 4.7</w:t>
+            </w:r>
+          </w:p>
+        </w:tc>
+        <w:tc>
+          <w:tcPr/>
+          <w:p>
+            <w:pPr>
+              <w:pStyle w:val="Compact"/>
+              <w:jc w:val="right"/>
+            </w:pPr>
+            <w:r>
+              <w:t xml:space="preserve">Fold reduction (4.6 to 4.7)</w:t>
             </w:r>
           </w:p>
         </w:tc>
@@ -5800,42 +5804,46 @@
           <w:p>
             <w:pPr>
               <w:pStyle w:val="Compact"/>
-            </w:pPr>
-            <w:r>
-              <w:t xml:space="preserve">Google</w:t>
-            </w:r>
-          </w:p>
-        </w:tc>
-        <w:tc>
-          <w:tcPr/>
-          <w:p>
-            <w:pPr>
-              <w:pStyle w:val="Compact"/>
-            </w:pPr>
-            <w:r>
-              <w:t xml:space="preserve">Gemini 3.0 Flash, Gemini 3.1 Flash Lite</w:t>
-            </w:r>
-          </w:p>
-        </w:tc>
-        <w:tc>
-          <w:tcPr/>
-          <w:p>
-            <w:pPr>
-              <w:pStyle w:val="Compact"/>
-            </w:pPr>
-            <w:r>
-              <w:t xml:space="preserve">57.8%</w:t>
-            </w:r>
-          </w:p>
-        </w:tc>
-        <w:tc>
-          <w:tcPr/>
-          <w:p>
-            <w:pPr>
-              <w:pStyle w:val="Compact"/>
-            </w:pPr>
-            <w:r>
-              <w:t xml:space="preserve">156/270</w:t>
+              <w:jc w:val="left"/>
+            </w:pPr>
+            <w:r>
+              <w:t xml:space="preserve">Tool-return, full 27-scenario corpus</w:t>
+            </w:r>
+          </w:p>
+        </w:tc>
+        <w:tc>
+          <w:tcPr/>
+          <w:p>
+            <w:pPr>
+              <w:pStyle w:val="Compact"/>
+              <w:jc w:val="right"/>
+            </w:pPr>
+            <w:r>
+              <w:t xml:space="preserve">26.7% (36/135)</w:t>
+            </w:r>
+          </w:p>
+        </w:tc>
+        <w:tc>
+          <w:tcPr/>
+          <w:p>
+            <w:pPr>
+              <w:pStyle w:val="Compact"/>
+              <w:jc w:val="right"/>
+            </w:pPr>
+            <w:r>
+              <w:t xml:space="preserve">11.9% (16/135)</w:t>
+            </w:r>
+          </w:p>
+        </w:tc>
+        <w:tc>
+          <w:tcPr/>
+          <w:p>
+            <w:pPr>
+              <w:pStyle w:val="Compact"/>
+              <w:jc w:val="right"/>
+            </w:pPr>
+            <w:r>
+              <w:t xml:space="preserve">2.2</w:t>
             </w:r>
           </w:p>
         </w:tc>
@@ -5846,42 +5854,46 @@
           <w:p>
             <w:pPr>
               <w:pStyle w:val="Compact"/>
-            </w:pPr>
-            <w:r>
-              <w:t xml:space="preserve">OpenAI</w:t>
-            </w:r>
-          </w:p>
-        </w:tc>
-        <w:tc>
-          <w:tcPr/>
-          <w:p>
-            <w:pPr>
-              <w:pStyle w:val="Compact"/>
-            </w:pPr>
-            <w:r>
-              <w:t xml:space="preserve">GPT-5.4 Mini, GPT-5.4 Nano</w:t>
-            </w:r>
-          </w:p>
-        </w:tc>
-        <w:tc>
-          <w:tcPr/>
-          <w:p>
-            <w:pPr>
-              <w:pStyle w:val="Compact"/>
-            </w:pPr>
-            <w:r>
-              <w:t xml:space="preserve">29.3%</w:t>
-            </w:r>
-          </w:p>
-        </w:tc>
-        <w:tc>
-          <w:tcPr/>
-          <w:p>
-            <w:pPr>
-              <w:pStyle w:val="Compact"/>
-            </w:pPr>
-            <w:r>
-              <w:t xml:space="preserve">79/270</w:t>
+              <w:jc w:val="left"/>
+            </w:pPr>
+            <w:r>
+              <w:t xml:space="preserve">Tool-return, adversarial-context subset</w:t>
+            </w:r>
+          </w:p>
+        </w:tc>
+        <w:tc>
+          <w:tcPr/>
+          <w:p>
+            <w:pPr>
+              <w:pStyle w:val="Compact"/>
+              <w:jc w:val="right"/>
+            </w:pPr>
+            <w:r>
+              <w:t xml:space="preserve">26.7% (16/60)</w:t>
+            </w:r>
+          </w:p>
+        </w:tc>
+        <w:tc>
+          <w:tcPr/>
+          <w:p>
+            <w:pPr>
+              <w:pStyle w:val="Compact"/>
+              <w:jc w:val="right"/>
+            </w:pPr>
+            <w:r>
+              <w:t xml:space="preserve">3.3% (2/60)</w:t>
+            </w:r>
+          </w:p>
+        </w:tc>
+        <w:tc>
+          <w:tcPr/>
+          <w:p>
+            <w:pPr>
+              <w:pStyle w:val="Compact"/>
+              <w:jc w:val="right"/>
+            </w:pPr>
+            <w:r>
+              <w:t xml:space="preserve">8.0</w:t>
             </w:r>
           </w:p>
         </w:tc>
@@ -5892,42 +5904,46 @@
           <w:p>
             <w:pPr>
               <w:pStyle w:val="Compact"/>
-            </w:pPr>
-            <w:r>
-              <w:t xml:space="preserve">Anthropic</w:t>
-            </w:r>
-          </w:p>
-        </w:tc>
-        <w:tc>
-          <w:tcPr/>
-          <w:p>
-            <w:pPr>
-              <w:pStyle w:val="Compact"/>
-            </w:pPr>
-            <w:r>
-              <w:t xml:space="preserve">Opus 4.7, Opus 4.6, Sonnet 4.6, Sonnet 4.5, Haiku 4.5</w:t>
-            </w:r>
-          </w:p>
-        </w:tc>
-        <w:tc>
-          <w:tcPr/>
-          <w:p>
-            <w:pPr>
-              <w:pStyle w:val="Compact"/>
-            </w:pPr>
-            <w:r>
-              <w:t xml:space="preserve">21.0%</w:t>
-            </w:r>
-          </w:p>
-        </w:tc>
-        <w:tc>
-          <w:tcPr/>
-          <w:p>
-            <w:pPr>
-              <w:pStyle w:val="Compact"/>
-            </w:pPr>
-            <w:r>
-              <w:t xml:space="preserve">142/675</w:t>
+              <w:jc w:val="left"/>
+            </w:pPr>
+            <w:r>
+              <w:t xml:space="preserve">Tool-return, professional-context subset</w:t>
+            </w:r>
+          </w:p>
+        </w:tc>
+        <w:tc>
+          <w:tcPr/>
+          <w:p>
+            <w:pPr>
+              <w:pStyle w:val="Compact"/>
+              <w:jc w:val="right"/>
+            </w:pPr>
+            <w:r>
+              <w:t xml:space="preserve">14.3% (5/35)</w:t>
+            </w:r>
+          </w:p>
+        </w:tc>
+        <w:tc>
+          <w:tcPr/>
+          <w:p>
+            <w:pPr>
+              <w:pStyle w:val="Compact"/>
+              <w:jc w:val="right"/>
+            </w:pPr>
+            <w:r>
+              <w:t xml:space="preserve">11.4% (4/35)</w:t>
+            </w:r>
+          </w:p>
+        </w:tc>
+        <w:tc>
+          <w:tcPr/>
+          <w:p>
+            <w:pPr>
+              <w:pStyle w:val="Compact"/>
+              <w:jc w:val="right"/>
+            </w:pPr>
+            <w:r>
+              <w:t xml:space="preserve">1.3</w:t>
             </w:r>
           </w:p>
         </w:tc>
@@ -5938,54 +5954,96 @@
           <w:p>
             <w:pPr>
               <w:pStyle w:val="Compact"/>
-            </w:pPr>
-            <w:r>
-              <w:rPr>
-                <w:b/>
-                <w:bCs/>
-              </w:rPr>
-              <w:t xml:space="preserve">Pooled (9 models)</w:t>
-            </w:r>
-          </w:p>
-        </w:tc>
-        <w:tc>
-          <w:tcPr/>
-          <w:p>
-            <w:pPr>
-              <w:pStyle w:val="Compact"/>
-            </w:pPr>
-            <w:r>
-              <w:t xml:space="preserve">All laboratories</w:t>
-            </w:r>
-          </w:p>
-        </w:tc>
-        <w:tc>
-          <w:tcPr/>
-          <w:p>
-            <w:pPr>
-              <w:pStyle w:val="Compact"/>
-            </w:pPr>
-            <w:r>
-              <w:rPr>
-                <w:b/>
-                <w:bCs/>
-              </w:rPr>
-              <w:t xml:space="preserve">31.0%</w:t>
-            </w:r>
-          </w:p>
-        </w:tc>
-        <w:tc>
-          <w:tcPr/>
-          <w:p>
-            <w:pPr>
-              <w:pStyle w:val="Compact"/>
-            </w:pPr>
-            <w:r>
-              <w:rPr>
-                <w:b/>
-                <w:bCs/>
-              </w:rPr>
-              <w:t xml:space="preserve">377/1,215</w:t>
+              <w:jc w:val="left"/>
+            </w:pPr>
+            <w:r>
+              <w:t xml:space="preserve">Tool-return, consumer-context subset</w:t>
+            </w:r>
+          </w:p>
+        </w:tc>
+        <w:tc>
+          <w:tcPr/>
+          <w:p>
+            <w:pPr>
+              <w:pStyle w:val="Compact"/>
+              <w:jc w:val="right"/>
+            </w:pPr>
+            <w:r>
+              <w:t xml:space="preserve">33.3% (10/30)</w:t>
+            </w:r>
+          </w:p>
+        </w:tc>
+        <w:tc>
+          <w:tcPr/>
+          <w:p>
+            <w:pPr>
+              <w:pStyle w:val="Compact"/>
+              <w:jc w:val="right"/>
+            </w:pPr>
+            <w:r>
+              <w:t xml:space="preserve">10.0% (3/30)</w:t>
+            </w:r>
+          </w:p>
+        </w:tc>
+        <w:tc>
+          <w:tcPr/>
+          <w:p>
+            <w:pPr>
+              <w:pStyle w:val="Compact"/>
+              <w:jc w:val="right"/>
+            </w:pPr>
+            <w:r>
+              <w:t xml:space="preserve">3.3</w:t>
+            </w:r>
+          </w:p>
+        </w:tc>
+      </w:tr>
+      <w:tr>
+        <w:tc>
+          <w:tcPr/>
+          <w:p>
+            <w:pPr>
+              <w:pStyle w:val="Compact"/>
+              <w:jc w:val="left"/>
+            </w:pPr>
+            <w:r>
+              <w:t xml:space="preserve">Grounded tool-return, 27-scenario corpus</w:t>
+            </w:r>
+          </w:p>
+        </w:tc>
+        <w:tc>
+          <w:tcPr/>
+          <w:p>
+            <w:pPr>
+              <w:pStyle w:val="Compact"/>
+              <w:jc w:val="right"/>
+            </w:pPr>
+            <w:r>
+              <w:t xml:space="preserve">17.7% (20/113)</w:t>
+            </w:r>
+          </w:p>
+        </w:tc>
+        <w:tc>
+          <w:tcPr/>
+          <w:p>
+            <w:pPr>
+              <w:pStyle w:val="Compact"/>
+              <w:jc w:val="right"/>
+            </w:pPr>
+            <w:r>
+              <w:t xml:space="preserve">4.5% (5/112)</w:t>
+            </w:r>
+          </w:p>
+        </w:tc>
+        <w:tc>
+          <w:tcPr/>
+          <w:p>
+            <w:pPr>
+              <w:pStyle w:val="Compact"/>
+              <w:jc w:val="right"/>
+            </w:pPr>
+            <w:r>
+              <w:t xml:space="preserve">3.9</w:t>
             </w:r>
           </w:p>
         </w:tc>
@@ -6006,7 +6064,7 @@
         <w:t xml:space="preserve"> </w:t>
       </w:r>
       <w:r>
-        <w:t xml:space="preserve">Wilson-score 95 per cent confidence intervals on the laboratory-pooled rates are 51.8 to 63.5 per cent (Google), 24.2 to 34.9 per cent (OpenAI), and 18.1 to 24.3 per cent (Anthropic). The cross-laboratory range spans 36.8 percentage points within a single condition and is consistent with organisation-level alignment-training choices layered on top of the shared inference-time channel signal. Two-sided two-proportion z-tests at</w:t>
+        <w:t xml:space="preserve">Within-family hardening concentrates on the adversarial-context subset, where the user query itself surfaces harmful intent and the query-framing-cued refusal guardrails activate; the smaller reductions on professional-context and consumer-context subsets indicate that the channel-conditioned authority signal persists when the user query does not surface harmful-intent cues. Subset Ns per model: 60 adversarial-context (12 scenarios × 5 replicates), 35 professional-context (7 × 5), 30 consumer-context (6 × 5), and 10 MINOR positive-control (2 scenarios × 5; ENV_02, ACA_01) which are aggregated into the 27-scenario row 1 but not analysed separately because they function as judge-calibration anchors with high baseline compliance independent of the channel mechanism. Within-subset 4.6-versus-4.7 reduction tested with paired McNemar’s exact at</w:t>
       </w:r>
       <w:r>
         <w:t xml:space="preserve"> </w:t>
@@ -6030,13 +6088,13 @@
       </w:r>
     </w:p>
     <w:bookmarkEnd w:id="46"/>
-    <w:bookmarkStart w:id="47" w:name="table-4"/>
+    <w:bookmarkStart w:id="47" w:name="extended-data"/>
     <w:p>
       <w:pPr>
         <w:pStyle w:val="Heading2"/>
       </w:pPr>
       <w:r>
-        <w:t xml:space="preserve">Table 4</w:t>
+        <w:t xml:space="preserve">Extended Data</w:t>
       </w:r>
     </w:p>
     <w:p>
@@ -6048,13 +6106,13 @@
           <w:b/>
           <w:bCs/>
         </w:rPr>
-        <w:t xml:space="preserve">Table 4 | Generational comparison within the Anthropic Opus family.</w:t>
-      </w:r>
-      <w:r>
-        <w:t xml:space="preserve"> </w:t>
-      </w:r>
-      <w:r>
-        <w:t xml:space="preserve">Identical scenarios, identical tool surface, and identical judge.</w:t>
+        <w:t xml:space="preserve">Extended Data Table 1 | Per-laboratory pooled compliance on the tool-return condition.</w:t>
+      </w:r>
+      <w:r>
+        <w:t xml:space="preserve"> </w:t>
+      </w:r>
+      <w:r>
+        <w:t xml:space="preserve">Models are pooled within laboratory across the 27-scenario corpus at five replicates per cell.</w:t>
       </w:r>
     </w:p>
     <w:tbl>
@@ -6079,46 +6137,42 @@
           <w:p>
             <w:pPr>
               <w:pStyle w:val="Compact"/>
-              <w:jc w:val="left"/>
-            </w:pPr>
-            <w:r>
-              <w:t xml:space="preserve">Comparison</w:t>
-            </w:r>
-          </w:p>
-        </w:tc>
-        <w:tc>
-          <w:tcPr/>
-          <w:p>
-            <w:pPr>
-              <w:pStyle w:val="Compact"/>
-              <w:jc w:val="right"/>
-            </w:pPr>
-            <w:r>
-              <w:t xml:space="preserve">Opus 4.6</w:t>
-            </w:r>
-          </w:p>
-        </w:tc>
-        <w:tc>
-          <w:tcPr/>
-          <w:p>
-            <w:pPr>
-              <w:pStyle w:val="Compact"/>
-              <w:jc w:val="right"/>
-            </w:pPr>
-            <w:r>
-              <w:t xml:space="preserve">Opus 4.7</w:t>
-            </w:r>
-          </w:p>
-        </w:tc>
-        <w:tc>
-          <w:tcPr/>
-          <w:p>
-            <w:pPr>
-              <w:pStyle w:val="Compact"/>
-              <w:jc w:val="right"/>
-            </w:pPr>
-            <w:r>
-              <w:t xml:space="preserve">Fold reduction (4.6 to 4.7)</w:t>
+            </w:pPr>
+            <w:r>
+              <w:t xml:space="preserve">Laboratory</w:t>
+            </w:r>
+          </w:p>
+        </w:tc>
+        <w:tc>
+          <w:tcPr/>
+          <w:p>
+            <w:pPr>
+              <w:pStyle w:val="Compact"/>
+            </w:pPr>
+            <w:r>
+              <w:t xml:space="preserve">Models in panel</w:t>
+            </w:r>
+          </w:p>
+        </w:tc>
+        <w:tc>
+          <w:tcPr/>
+          <w:p>
+            <w:pPr>
+              <w:pStyle w:val="Compact"/>
+            </w:pPr>
+            <w:r>
+              <w:t xml:space="preserve">Tool-return compliance</w:t>
+            </w:r>
+          </w:p>
+        </w:tc>
+        <w:tc>
+          <w:tcPr/>
+          <w:p>
+            <w:pPr>
+              <w:pStyle w:val="Compact"/>
+            </w:pPr>
+            <w:r>
+              <w:t xml:space="preserve">n</w:t>
             </w:r>
           </w:p>
         </w:tc>
@@ -6129,46 +6183,42 @@
           <w:p>
             <w:pPr>
               <w:pStyle w:val="Compact"/>
-              <w:jc w:val="left"/>
-            </w:pPr>
-            <w:r>
-              <w:t xml:space="preserve">Tool-return, full 27-scenario corpus</w:t>
-            </w:r>
-          </w:p>
-        </w:tc>
-        <w:tc>
-          <w:tcPr/>
-          <w:p>
-            <w:pPr>
-              <w:pStyle w:val="Compact"/>
-              <w:jc w:val="right"/>
-            </w:pPr>
-            <w:r>
-              <w:t xml:space="preserve">26.7% (36/135)</w:t>
-            </w:r>
-          </w:p>
-        </w:tc>
-        <w:tc>
-          <w:tcPr/>
-          <w:p>
-            <w:pPr>
-              <w:pStyle w:val="Compact"/>
-              <w:jc w:val="right"/>
-            </w:pPr>
-            <w:r>
-              <w:t xml:space="preserve">11.9% (16/135)</w:t>
-            </w:r>
-          </w:p>
-        </w:tc>
-        <w:tc>
-          <w:tcPr/>
-          <w:p>
-            <w:pPr>
-              <w:pStyle w:val="Compact"/>
-              <w:jc w:val="right"/>
-            </w:pPr>
-            <w:r>
-              <w:t xml:space="preserve">2.2</w:t>
+            </w:pPr>
+            <w:r>
+              <w:t xml:space="preserve">Google</w:t>
+            </w:r>
+          </w:p>
+        </w:tc>
+        <w:tc>
+          <w:tcPr/>
+          <w:p>
+            <w:pPr>
+              <w:pStyle w:val="Compact"/>
+            </w:pPr>
+            <w:r>
+              <w:t xml:space="preserve">Gemini 3.0 Flash, Gemini 3.1 Flash Lite</w:t>
+            </w:r>
+          </w:p>
+        </w:tc>
+        <w:tc>
+          <w:tcPr/>
+          <w:p>
+            <w:pPr>
+              <w:pStyle w:val="Compact"/>
+            </w:pPr>
+            <w:r>
+              <w:t xml:space="preserve">57.8%</w:t>
+            </w:r>
+          </w:p>
+        </w:tc>
+        <w:tc>
+          <w:tcPr/>
+          <w:p>
+            <w:pPr>
+              <w:pStyle w:val="Compact"/>
+            </w:pPr>
+            <w:r>
+              <w:t xml:space="preserve">156/270</w:t>
             </w:r>
           </w:p>
         </w:tc>
@@ -6179,46 +6229,42 @@
           <w:p>
             <w:pPr>
               <w:pStyle w:val="Compact"/>
-              <w:jc w:val="left"/>
-            </w:pPr>
-            <w:r>
-              <w:t xml:space="preserve">Tool-return, adversarial-context subset</w:t>
-            </w:r>
-          </w:p>
-        </w:tc>
-        <w:tc>
-          <w:tcPr/>
-          <w:p>
-            <w:pPr>
-              <w:pStyle w:val="Compact"/>
-              <w:jc w:val="right"/>
-            </w:pPr>
-            <w:r>
-              <w:t xml:space="preserve">26.7% (16/60)</w:t>
-            </w:r>
-          </w:p>
-        </w:tc>
-        <w:tc>
-          <w:tcPr/>
-          <w:p>
-            <w:pPr>
-              <w:pStyle w:val="Compact"/>
-              <w:jc w:val="right"/>
-            </w:pPr>
-            <w:r>
-              <w:t xml:space="preserve">3.3% (2/60)</w:t>
-            </w:r>
-          </w:p>
-        </w:tc>
-        <w:tc>
-          <w:tcPr/>
-          <w:p>
-            <w:pPr>
-              <w:pStyle w:val="Compact"/>
-              <w:jc w:val="right"/>
-            </w:pPr>
-            <w:r>
-              <w:t xml:space="preserve">8.0</w:t>
+            </w:pPr>
+            <w:r>
+              <w:t xml:space="preserve">OpenAI</w:t>
+            </w:r>
+          </w:p>
+        </w:tc>
+        <w:tc>
+          <w:tcPr/>
+          <w:p>
+            <w:pPr>
+              <w:pStyle w:val="Compact"/>
+            </w:pPr>
+            <w:r>
+              <w:t xml:space="preserve">GPT-5.4 Mini, GPT-5.4 Nano</w:t>
+            </w:r>
+          </w:p>
+        </w:tc>
+        <w:tc>
+          <w:tcPr/>
+          <w:p>
+            <w:pPr>
+              <w:pStyle w:val="Compact"/>
+            </w:pPr>
+            <w:r>
+              <w:t xml:space="preserve">29.3%</w:t>
+            </w:r>
+          </w:p>
+        </w:tc>
+        <w:tc>
+          <w:tcPr/>
+          <w:p>
+            <w:pPr>
+              <w:pStyle w:val="Compact"/>
+            </w:pPr>
+            <w:r>
+              <w:t xml:space="preserve">79/270</w:t>
             </w:r>
           </w:p>
         </w:tc>
@@ -6229,46 +6275,42 @@
           <w:p>
             <w:pPr>
               <w:pStyle w:val="Compact"/>
-              <w:jc w:val="left"/>
-            </w:pPr>
-            <w:r>
-              <w:t xml:space="preserve">Tool-return, professional-context subset</w:t>
-            </w:r>
-          </w:p>
-        </w:tc>
-        <w:tc>
-          <w:tcPr/>
-          <w:p>
-            <w:pPr>
-              <w:pStyle w:val="Compact"/>
-              <w:jc w:val="right"/>
-            </w:pPr>
-            <w:r>
-              <w:t xml:space="preserve">14.3% (5/35)</w:t>
-            </w:r>
-          </w:p>
-        </w:tc>
-        <w:tc>
-          <w:tcPr/>
-          <w:p>
-            <w:pPr>
-              <w:pStyle w:val="Compact"/>
-              <w:jc w:val="right"/>
-            </w:pPr>
-            <w:r>
-              <w:t xml:space="preserve">11.4% (4/35)</w:t>
-            </w:r>
-          </w:p>
-        </w:tc>
-        <w:tc>
-          <w:tcPr/>
-          <w:p>
-            <w:pPr>
-              <w:pStyle w:val="Compact"/>
-              <w:jc w:val="right"/>
-            </w:pPr>
-            <w:r>
-              <w:t xml:space="preserve">1.3</w:t>
+            </w:pPr>
+            <w:r>
+              <w:t xml:space="preserve">Anthropic</w:t>
+            </w:r>
+          </w:p>
+        </w:tc>
+        <w:tc>
+          <w:tcPr/>
+          <w:p>
+            <w:pPr>
+              <w:pStyle w:val="Compact"/>
+            </w:pPr>
+            <w:r>
+              <w:t xml:space="preserve">Opus 4.7, Opus 4.6, Sonnet 4.6, Sonnet 4.5, Haiku 4.5</w:t>
+            </w:r>
+          </w:p>
+        </w:tc>
+        <w:tc>
+          <w:tcPr/>
+          <w:p>
+            <w:pPr>
+              <w:pStyle w:val="Compact"/>
+            </w:pPr>
+            <w:r>
+              <w:t xml:space="preserve">21.0%</w:t>
+            </w:r>
+          </w:p>
+        </w:tc>
+        <w:tc>
+          <w:tcPr/>
+          <w:p>
+            <w:pPr>
+              <w:pStyle w:val="Compact"/>
+            </w:pPr>
+            <w:r>
+              <w:t xml:space="preserve">142/675</w:t>
             </w:r>
           </w:p>
         </w:tc>
@@ -6279,96 +6321,54 @@
           <w:p>
             <w:pPr>
               <w:pStyle w:val="Compact"/>
-              <w:jc w:val="left"/>
-            </w:pPr>
-            <w:r>
-              <w:t xml:space="preserve">Tool-return, consumer-context subset</w:t>
-            </w:r>
-          </w:p>
-        </w:tc>
-        <w:tc>
-          <w:tcPr/>
-          <w:p>
-            <w:pPr>
-              <w:pStyle w:val="Compact"/>
-              <w:jc w:val="right"/>
-            </w:pPr>
-            <w:r>
-              <w:t xml:space="preserve">33.3% (10/30)</w:t>
-            </w:r>
-          </w:p>
-        </w:tc>
-        <w:tc>
-          <w:tcPr/>
-          <w:p>
-            <w:pPr>
-              <w:pStyle w:val="Compact"/>
-              <w:jc w:val="right"/>
-            </w:pPr>
-            <w:r>
-              <w:t xml:space="preserve">10.0% (3/30)</w:t>
-            </w:r>
-          </w:p>
-        </w:tc>
-        <w:tc>
-          <w:tcPr/>
-          <w:p>
-            <w:pPr>
-              <w:pStyle w:val="Compact"/>
-              <w:jc w:val="right"/>
-            </w:pPr>
-            <w:r>
-              <w:t xml:space="preserve">3.3</w:t>
-            </w:r>
-          </w:p>
-        </w:tc>
-      </w:tr>
-      <w:tr>
-        <w:tc>
-          <w:tcPr/>
-          <w:p>
-            <w:pPr>
-              <w:pStyle w:val="Compact"/>
-              <w:jc w:val="left"/>
-            </w:pPr>
-            <w:r>
-              <w:t xml:space="preserve">Grounded tool-return, 27-scenario corpus</w:t>
-            </w:r>
-          </w:p>
-        </w:tc>
-        <w:tc>
-          <w:tcPr/>
-          <w:p>
-            <w:pPr>
-              <w:pStyle w:val="Compact"/>
-              <w:jc w:val="right"/>
-            </w:pPr>
-            <w:r>
-              <w:t xml:space="preserve">17.7% (20/113)</w:t>
-            </w:r>
-          </w:p>
-        </w:tc>
-        <w:tc>
-          <w:tcPr/>
-          <w:p>
-            <w:pPr>
-              <w:pStyle w:val="Compact"/>
-              <w:jc w:val="right"/>
-            </w:pPr>
-            <w:r>
-              <w:t xml:space="preserve">4.5% (5/112)</w:t>
-            </w:r>
-          </w:p>
-        </w:tc>
-        <w:tc>
-          <w:tcPr/>
-          <w:p>
-            <w:pPr>
-              <w:pStyle w:val="Compact"/>
-              <w:jc w:val="right"/>
-            </w:pPr>
-            <w:r>
-              <w:t xml:space="preserve">3.9</w:t>
+            </w:pPr>
+            <w:r>
+              <w:rPr>
+                <w:b/>
+                <w:bCs/>
+              </w:rPr>
+              <w:t xml:space="preserve">Pooled (9 models)</w:t>
+            </w:r>
+          </w:p>
+        </w:tc>
+        <w:tc>
+          <w:tcPr/>
+          <w:p>
+            <w:pPr>
+              <w:pStyle w:val="Compact"/>
+            </w:pPr>
+            <w:r>
+              <w:t xml:space="preserve">All laboratories</w:t>
+            </w:r>
+          </w:p>
+        </w:tc>
+        <w:tc>
+          <w:tcPr/>
+          <w:p>
+            <w:pPr>
+              <w:pStyle w:val="Compact"/>
+            </w:pPr>
+            <w:r>
+              <w:rPr>
+                <w:b/>
+                <w:bCs/>
+              </w:rPr>
+              <w:t xml:space="preserve">31.0%</w:t>
+            </w:r>
+          </w:p>
+        </w:tc>
+        <w:tc>
+          <w:tcPr/>
+          <w:p>
+            <w:pPr>
+              <w:pStyle w:val="Compact"/>
+            </w:pPr>
+            <w:r>
+              <w:rPr>
+                <w:b/>
+                <w:bCs/>
+              </w:rPr>
+              <w:t xml:space="preserve">377/1,215</w:t>
             </w:r>
           </w:p>
         </w:tc>
@@ -6389,7 +6389,7 @@
         <w:t xml:space="preserve"> </w:t>
       </w:r>
       <w:r>
-        <w:t xml:space="preserve">Within-family hardening concentrates on the adversarial-context subset, where the user query itself surfaces harmful intent and the query-framing-cued refusal guardrails activate; the smaller reductions on professional-context and consumer-context subsets indicate that the channel-conditioned authority signal persists when the user query does not surface harmful-intent cues. Subset Ns per model: 60 adversarial-context (12 scenarios × 5 replicates), 35 professional-context (7 × 5), 30 consumer-context (6 × 5), and 10 MINOR positive-control (2 scenarios × 5; ENV_02, ACA_01) which are aggregated into the 27-scenario row 1 but not analysed separately because they function as judge-calibration anchors with high baseline compliance independent of the channel mechanism. Within-subset 4.6-versus-4.7 reduction tested with paired McNemar’s exact at</w:t>
+        <w:t xml:space="preserve">Wilson-score 95 per cent confidence intervals on the laboratory-pooled rates are 51.8 to 63.5 per cent (Google), 24.2 to 34.9 per cent (OpenAI), and 18.1 to 24.3 per cent (Anthropic). The cross-laboratory range spans 36.8 percentage points within a single condition and is consistent with organisation-level alignment-training choices layered on top of the shared inference-time channel signal. Two-sided two-proportion z-tests at</w:t>
       </w:r>
       <w:r>
         <w:t xml:space="preserve"> </w:t>
@@ -6413,7 +6413,7 @@
       </w:r>
     </w:p>
     <w:bookmarkEnd w:id="47"/>
-    <w:bookmarkStart w:id="48" w:name="data-availability"/>
+    <w:bookmarkStart w:id="49" w:name="data-availability"/>
     <w:p>
       <w:pPr>
         <w:pStyle w:val="Heading2"/>
@@ -6427,7 +6427,24 @@
         <w:pStyle w:val="FirstParagraph"/>
       </w:pPr>
       <w:r>
-        <w:t xml:space="preserve">The complete dataset of 15,903 per-trial JSON records (the 5,869-trial closed-weight base panel reported in the main text, the 2,700-trial four-model open-weight panel reported in Supplementary §S12, a 20-trial gemma-3-27b pilot fragment retained for provenance but excluded from every analysis, and 7,314 further records, principally the extended-replicate collection on the tool-return and user-imperative cells used for matched-pair construction and the replication check in Methods; two further extension records were unreadable after a concurrent-write fault and are quarantined outside this count), each retaining model identifiers, scenario metadata, condition assignment, full prompt and response text, tool-call traces, and three-dimension judge scores, is archived at Zenodo (DOI to be assigned at submission) under a CC-BY-4.0 licence. The GitHub repository linked in the abstract mirrors, at git tag</w:t>
+        <w:t xml:space="preserve">The complete dataset of 15,903 per-trial JSON records (the 5,869-trial closed-weight base panel reported in the main text, the 2,700-trial four-model open-weight panel reported in Supplementary §S12, a 20-trial gemma-3-27b pilot fragment retained for provenance but excluded from every analysis, and 7,314 further records, principally the extended-replicate collection on the tool-return and user-imperative cells used for matched-pair construction and the replication check in Methods; two further extension records were unreadable after a concurrent-write fault and are quarantined outside this count), each retaining model identifiers, scenario metadata, condition assignment, full prompt and response text, tool-call traces, and three-dimension judge scores, is publicly available in the GitHub repository at</w:t>
+      </w:r>
+      <w:r>
+        <w:t xml:space="preserve"> </w:t>
+      </w:r>
+      <w:hyperlink r:id="rId48">
+        <w:r>
+          <w:rPr>
+            <w:rStyle w:val="Hyperlink"/>
+          </w:rPr>
+          <w:t xml:space="preserve">https://github.com/FelipeMAffonso/authority-laundering</w:t>
+        </w:r>
+      </w:hyperlink>
+      <w:r>
+        <w:t xml:space="preserve"> </w:t>
+      </w:r>
+      <w:r>
+        <w:t xml:space="preserve">under a CC-BY-4.0 licence. At git tag</w:t>
       </w:r>
       <w:r>
         <w:t xml:space="preserve"> </w:t>
@@ -6439,10 +6456,10 @@
         <w:t xml:space="preserve">v1.0</w:t>
       </w:r>
       <w:r>
-        <w:t xml:space="preserve">, the closed- and open-weight panels that reproduce the main-text headline numbers; the complete corpus including the extended replicates is archived at Zenodo and available to qualified researchers under a data-use agreement. Operational payloads on four SEVERE scenarios (specific paediatric dosing schedules, multi-day warfarin-NSAID regimens, the TLS-disable configuration, and the SQL-injection pattern) are redacted in the public release on every affected record, with the per-scenario redaction inventory shipped alongside the release; no redacted field is consulted by the verification script, so the redacted release reproduces the main-text headline numbers. The unredacted corpus is available to qualified researchers under a data-use agreement; requests should be directed to the corresponding author with institutional affiliation and a one-paragraph research description, and the redaction inventory is documented in the ethics statement.</w:t>
-      </w:r>
-    </w:p>
-    <w:bookmarkEnd w:id="48"/>
+        <w:t xml:space="preserve">, the repository carries the closed- and open-weight panels that reproduce the main-text headline numbers together with a one-command verification script; the complete corpus including the extended replicates is available to qualified researchers under a data-use agreement. Operational payloads on four SEVERE scenarios (specific paediatric dosing schedules, multi-day warfarin-NSAID regimens, the TLS-disable configuration, and the SQL-injection pattern) are redacted in the public release on every affected record, with the per-scenario redaction inventory shipped alongside the release; no redacted field is consulted by the verification script, so the redacted release reproduces the main-text headline numbers. The unredacted corpus is available to qualified researchers under a data-use agreement; requests should be directed to the corresponding author with institutional affiliation and a one-paragraph research description, and the redaction inventory is documented in the ethics statement.</w:t>
+      </w:r>
+    </w:p>
+    <w:bookmarkEnd w:id="49"/>
     <w:bookmarkStart w:id="50" w:name="code-availability"/>
     <w:p>
       <w:pPr>
@@ -6457,7 +6474,7 @@
         <w:pStyle w:val="FirstParagraph"/>
       </w:pPr>
       <w:r>
-        <w:t xml:space="preserve">All analysis code is written in Python 3.11 with pinned dependencies. The repository covers the conversational harness, the judge, the scenario bank, the figure generators, and the mechanism pipeline; the README documents the module layout. Data collection consumed approximately 30,400 subject and judge API calls in April 2026 across the closed-weight panel (US$200 to US$250 across Anthropic, OpenAI, and Google) and approximately 13,500 OpenRouter calls for the four-model open-weight panel reported in Supplementary §S12 (under US$5). The repository is archived at Zenodo (DOI to be assigned at submission) under an MIT licence at git tag</w:t>
+        <w:t xml:space="preserve">All analysis code is written in Python 3.11 with pinned dependencies. The repository covers the conversational harness, the judge, the scenario bank, the figure generators, and the mechanism pipeline; the README documents the module layout. Data collection consumed approximately 30,400 subject and judge API calls in April 2026 across the closed-weight panel (US$200 to US$250 across Anthropic, OpenAI, and Google) and approximately 13,500 OpenRouter calls for the four-model open-weight panel reported in Supplementary §S12 (under US$5). The repository is publicly available under an MIT licence at git tag</w:t>
       </w:r>
       <w:r>
         <w:t xml:space="preserve"> </w:t>
@@ -6472,12 +6489,12 @@
         <w:t xml:space="preserve"> </w:t>
       </w:r>
       <w:r>
-        <w:t xml:space="preserve">and mirrored at</w:t>
-      </w:r>
-      <w:r>
-        <w:t xml:space="preserve"> </w:t>
-      </w:r>
-      <w:hyperlink r:id="rId49">
+        <w:t xml:space="preserve">at</w:t>
+      </w:r>
+      <w:r>
+        <w:t xml:space="preserve"> </w:t>
+      </w:r>
+      <w:hyperlink r:id="rId48">
         <w:r>
           <w:rPr>
             <w:rStyle w:val="Hyperlink"/>

</xml_diff>